<commit_message>
Add GitHub repository link to report and README
</commit_message>
<xml_diff>
--- a/Unit_1_LAN_Mini_Project_Report.docx
+++ b/Unit_1_LAN_Mini_Project_Report.docx
@@ -2779,6 +2779,56 @@
         <w:t xml:space="preserve"> Successful ping screenshot showing PC1 → PC3 and PC1 → PC4 with 0% packet loss</w:t>
       </w:r>
     </w:p>
+    <w:p>
+      <w:pPr>
+        <w:pStyle w:val="ListBullet"/>
+      </w:pPr>
+      <w:r>
+        <w:rPr>
+          <w:rFonts w:ascii="Segoe UI Symbol" w:hAnsi="Segoe UI Symbol"/>
+          <w:sz w:val="22"/>
+        </w:rPr>
+        <w:t xml:space="preserve">✓ </w:t>
+      </w:r>
+      <w:r>
+        <w:rPr>
+          <w:rFonts w:ascii="Times New Roman" w:hAnsi="Times New Roman"/>
+          <w:sz w:val="22"/>
+        </w:rPr>
+        <w:t>GitHub Repository: https://github.com/Pranavkotame/NPC-ASSIGNMENT-1.git</w:t>
+      </w:r>
+    </w:p>
+    <w:p>
+      <w:pPr>
+        <w:pStyle w:val="Heading1"/>
+      </w:pPr>
+      <w:r>
+        <w:rPr>
+          <w:rFonts w:ascii="Times New Roman" w:hAnsi="Times New Roman"/>
+          <w:sz w:val="32"/>
+        </w:rPr>
+        <w:t>12. GitHub Repository Link</w:t>
+      </w:r>
+    </w:p>
+    <w:p>
+      <w:r>
+        <w:rPr>
+          <w:rFonts w:ascii="Times New Roman" w:hAnsi="Times New Roman"/>
+          <w:sz w:val="22"/>
+        </w:rPr>
+        <w:t>All project files, Packet Tracer simulation (.pkt), network topology diagrams, and verification screenshots are available on GitHub at:</w:t>
+        <w:br/>
+      </w:r>
+      <w:r>
+        <w:rPr>
+          <w:rFonts w:ascii="Times New Roman" w:hAnsi="Times New Roman"/>
+          <w:color w:val="0066CC"/>
+          <w:sz w:val="22"/>
+          <w:u w:val="single"/>
+        </w:rPr>
+        <w:t>https://github.com/Pranavkotame/NPC-ASSIGNMENT-1.git</w:t>
+      </w:r>
+    </w:p>
     <w:sectPr>
       <w:footerReference w:type="default" r:id="rId10"/>
       <w:pgSz w:w="12240" w:h="15840"/>

</xml_diff>